<commit_message>
paper: update cover letter with all recent changes
- Date: May → Jun 2026
- TMA-UI: 0.792/+130% → 0.971/+183% (GA result)
- New paragraph: geometric vs PINN positioning ('topology gap' framing)
- New paragraph: explicit PINN distinction stated to editors
- Contribution bullets rewritten:
  - Geometric topology search as primary novelty (not just 'dual-track')
  - GA optimizer highlighted with GA vs random comparison (+8.5%)
  - Two-tier guardrail innovation (Tier 1 design constraints + Tier 2 validators)
  - Removed generic 'eleven constraints' — now explains the split

Co-Authored-By: Claude Sonnet 4.6 <noreply@anthropic.com>
</commit_message>
<xml_diff>
--- a/Paper/Cover_Letter_CEJ.docx
+++ b/Paper/Cover_Letter_CEJ.docx
@@ -69,7 +69,7 @@
           <w:i w:val="0"/>
           <w:sz w:val="22"/>
         </w:rPr>
-        <w:t>May 2026</w:t>
+        <w:t>Jun 2026</w:t>
       </w:r>
     </w:p>
     <w:p>
@@ -219,7 +219,7 @@
           <w:i w:val="0"/>
           <w:sz w:val="22"/>
         </w:rPr>
-        <w:t xml:space="preserve"> reactor engineering: designing showerhead gas distributors that achieve uniform precursor delivery. Our framework reduces design evaluation from hours to seconds and enables topology-level geometry search — discovering designs that parametric methods cannot represent, achieving a +130% </w:t>
+        <w:t xml:space="preserve"> (Atomic Layer Deposition) reactor engineering: designing showerhead gas distributors that deliver precursor gas uniformly across the wafer surface. The key insight is that the bottleneck in showerhead design is not analysis speed — it is access to geometries that parametric design tools structurally cannot represent. Our framework directly addresses this topology gap through two complementary tracks: Track 1 (</w:t>
       </w:r>
       <w:r>
         <w:rPr>
@@ -228,7 +228,7 @@
           <w:i w:val="0"/>
           <w:sz w:val="22"/>
         </w:rPr>
-        <w:t>TMA</w:t>
+        <w:t>PCGM</w:t>
       </w:r>
       <w:r>
         <w:rPr>
@@ -237,7 +237,76 @@
           <w:i w:val="0"/>
           <w:sz w:val="22"/>
         </w:rPr>
-        <w:t xml:space="preserve"> uniformity improvement.</w:t>
+        <w:t xml:space="preserve"> — Physics-Constrained Geometric Morphogenesis) for parametric search, and Track 2 (</w:t>
+      </w:r>
+      <w:r>
+        <w:rPr>
+          <w:rFonts w:ascii="Times New Roman" w:hAnsi="Times New Roman"/>
+          <w:b/>
+          <w:i w:val="0"/>
+          <w:sz w:val="22"/>
+        </w:rPr>
+        <w:t>VICES</w:t>
+      </w:r>
+      <w:r>
+        <w:rPr>
+          <w:rFonts w:ascii="Times New Roman" w:hAnsi="Times New Roman"/>
+          <w:b w:val="0"/>
+          <w:i w:val="0"/>
+          <w:sz w:val="22"/>
+        </w:rPr>
+        <w:t xml:space="preserve"> — Voxel-Implicit Computational Engineering Synthesis) for topology-level geometry synthesis using Constructive Solid Geometry (</w:t>
+      </w:r>
+      <w:r>
+        <w:rPr>
+          <w:rFonts w:ascii="Times New Roman" w:hAnsi="Times New Roman"/>
+          <w:b w:val="0"/>
+          <w:i w:val="0"/>
+          <w:sz w:val="22"/>
+        </w:rPr>
+        <w:t>CSG</w:t>
+      </w:r>
+      <w:r>
+        <w:rPr>
+          <w:rFonts w:ascii="Times New Roman" w:hAnsi="Times New Roman"/>
+          <w:b w:val="0"/>
+          <w:i w:val="0"/>
+          <w:sz w:val="22"/>
+        </w:rPr>
+        <w:t>). The best-performing design — an annular-ring nozzle pattern — cannot be constructed within any parametric design space at any parameter setting. The geometry itself is the contribution; the surrogate evaluates it quickly.</w:t>
+      </w:r>
+    </w:p>
+    <w:p>
+      <w:pPr>
+        <w:spacing w:after="120"/>
+        <w:jc w:val="both"/>
+      </w:pPr>
+      <w:r>
+        <w:rPr>
+          <w:rFonts w:ascii="Times New Roman" w:hAnsi="Times New Roman"/>
+          <w:b w:val="0"/>
+          <w:i w:val="0"/>
+          <w:sz w:val="22"/>
+        </w:rPr>
+        <w:t xml:space="preserve">This work is explicitly not a Physics-Informed Neural Network (PINN) or neural PDE solver contribution. Where PINN work asks "can we predict a fixed geometry's flow more accurately?", we ask "can we synthesise geometries that no parametric tool can reach?" — a fundamentally different and, for </w:t>
+      </w:r>
+      <w:r>
+        <w:rPr>
+          <w:rFonts w:ascii="Times New Roman" w:hAnsi="Times New Roman"/>
+          <w:b w:val="0"/>
+          <w:i w:val="0"/>
+          <w:sz w:val="22"/>
+        </w:rPr>
+        <w:t>ALD</w:t>
+      </w:r>
+      <w:r>
+        <w:rPr>
+          <w:rFonts w:ascii="Times New Roman" w:hAnsi="Times New Roman"/>
+          <w:b w:val="0"/>
+          <w:i w:val="0"/>
+          <w:sz w:val="22"/>
+        </w:rPr>
+        <w:t xml:space="preserve"> showerhead design, more impactful question.</w:t>
       </w:r>
     </w:p>
     <w:p>
@@ -268,7 +337,7 @@
           <w:i w:val="0"/>
           <w:sz w:val="22"/>
         </w:rPr>
-        <w:t xml:space="preserve">Novel dual-track framework: </w:t>
+        <w:t xml:space="preserve">Geometric topology search as primary novelty: </w:t>
       </w:r>
       <w:r>
         <w:rPr>
@@ -277,7 +346,7 @@
           <w:i w:val="0"/>
           <w:sz w:val="22"/>
         </w:rPr>
-        <w:t>first direct comparison of parametric and voxel-implicit CSG geometry synthesis for ALD reactor design.</w:t>
+        <w:t>Track 2 VICES synthesises four structurally distinct showerhead topology families (baffled, conical, annular, two-zone) using CSG boolean operations on Signed Distance Fields. The topology design space is formally characterised using Catalan numbers: C(n-1) distinct tree topologies for n primitives.</w:t>
       </w:r>
     </w:p>
     <w:p>
@@ -293,7 +362,7 @@
           <w:i w:val="0"/>
           <w:sz w:val="22"/>
         </w:rPr>
-        <w:t xml:space="preserve">Physics guardrail engine: </w:t>
+        <w:t xml:space="preserve">Genetic Algorithm-guided topology optimisation: </w:t>
       </w:r>
       <w:r>
         <w:rPr>
@@ -302,7 +371,7 @@
           <w:i w:val="0"/>
           <w:sz w:val="22"/>
         </w:rPr>
-        <w:t>eleven dimensionless constraints (Re, Ma, Eu, Pr, Nu, Bi, Sc, Sh, Pe_h, Pe_m, Da) enforcing physical validity.</w:t>
+        <w:t>a GA searches jointly over topology type and continuous dimensions, achieving TMA Uniformity Index = 0.971 vs Track 1 maximum of 0.344 — a +183% improvement. Random search achieves 0.895; the GA finds a further +8.5% by discovering an optimally-positioned baffled plenum topology.</w:t>
       </w:r>
     </w:p>
     <w:p>
@@ -318,7 +387,7 @@
           <w:i w:val="0"/>
           <w:sz w:val="22"/>
         </w:rPr>
-        <w:t xml:space="preserve">Topology discovery: </w:t>
+        <w:t xml:space="preserve">Two-tier physics guardrail engine: </w:t>
       </w:r>
       <w:r>
         <w:rPr>
@@ -327,7 +396,7 @@
           <w:i w:val="0"/>
           <w:sz w:val="22"/>
         </w:rPr>
-        <w:t>Track 2 achieves TMA-UI = 0.792 vs Track 1 maximum of 0.344 (+130%).</w:t>
+        <w:t>Tier 1 (Re, Ma, Eu, Da, Sc, Pe_m) enforces design constraints before inference; Tier 2 (Pr, Pe_h, Nu, Bi, Sh) validates physical consistency after prediction using Martin (1977) and Chilton-Colburn correlations. Tier 2 values update live as design parameters change.</w:t>
       </w:r>
     </w:p>
     <w:p>
@@ -343,7 +412,7 @@
           <w:i w:val="0"/>
           <w:sz w:val="22"/>
         </w:rPr>
-        <w:t xml:space="preserve">Open reproducibility: </w:t>
+        <w:t xml:space="preserve">Open and reproducible: </w:t>
       </w:r>
       <w:r>
         <w:rPr>
@@ -352,7 +421,7 @@
           <w:i w:val="0"/>
           <w:sz w:val="22"/>
         </w:rPr>
-        <w:t>all 123 OpenFOAM simulations and code at https://github.com/Ranaam21/cfd-ald-app.</w:t>
+        <w:t>all 123 OpenFOAM reactingFoam cases, training notebooks, and the interactive Streamlit dashboard are available at https://github.com/Ranaam21/cfd-ald-app.</w:t>
       </w:r>
     </w:p>
     <w:p>

</xml_diff>